<commit_message>
Add Chapter 7: Findings & Strategic Implications
Six use-case findings documenting what was learned through experimentation:
- Tool ecosystem: Claude as coherent Chat/Code/Desktop stack vs. enterprise tier
- Excel/PPT: verification of existing documents as the higher-value use case
- Cowork: skills files as compounding institutional IP
- Agents: human-in-loop as architectural requirement, not recommendation
- App building: specification quality as the binding constraint
- RAG chatbot: source document quality as the capability ceiling

Three strategic implications for Capgemini Engineering SE:
- SE practitioner role shift from executor to specifier
- Prompt/skills libraries as defensible IP
- Data-sovereign on-premises AI as a client deliverable

https://claude.ai/code/session_01TduzN5AmDMznVMCyFn9Vsg
</commit_message>
<xml_diff>
--- a/ECSE_WP11_Strategic_AI_Integration_v2.0.docx
+++ b/ECSE_WP11_Strategic_AI_Integration_v2.0.docx
@@ -17062,6 +17062,449 @@
       </w:pPr>
       <w:r>
         <w:t xml:space="preserve">Deploy the Streamlit app on an internal server. Team members access it from any browser. No AI expertise required to use it. The entire pipeline — documents, index, model, interface — stays inside the network. This is data sovereignty by design.</w:t>
+      </w:r>
+    </w:p>
+    <w:p>
+      <w:pPr>
+        <w:pStyle w:val="Normal"/>
+      </w:pPr>
+    </w:p>
+    <w:p>
+      <w:r>
+        <w:br w:type="page"/>
+      </w:r>
+    </w:p>
+    <w:p>
+      <w:pPr>
+        <w:pStyle w:val="Titre10"/>
+      </w:pPr>
+      <w:r>
+        <w:t xml:space="preserve">Findings &amp; Strategic Implications</w:t>
+      </w:r>
+    </w:p>
+    <w:p>
+      <w:pPr>
+        <w:pStyle w:val="Normal"/>
+      </w:pPr>
+    </w:p>
+    <w:p>
+      <w:pPr>
+        <w:pStyle w:val="Normal"/>
+      </w:pPr>
+      <w:r>
+        <w:t xml:space="preserve">This chapter synthesises what was learned from the six experiments documented in Chapter 6 and connects those findings back to the strategic question raised in Chapter 1: how should Capgemini Engineering's Systems Engineering department respond to a market in which both client expectations and client AI capability are rising simultaneously.</w:t>
+      </w:r>
+    </w:p>
+    <w:p>
+      <w:pPr>
+        <w:pStyle w:val="Normal"/>
+      </w:pPr>
+      <w:r>
+        <w:t xml:space="preserve">The findings are organised at two levels: use-case findings (specific observations from each experiment) and strategic implications (what those observations mean for the department's competitive positioning and service model).</w:t>
+      </w:r>
+    </w:p>
+    <w:p>
+      <w:pPr>
+        <w:pStyle w:val="Normal"/>
+      </w:pPr>
+    </w:p>
+    <w:p>
+      <w:pPr>
+        <w:pStyle w:val="Head1"/>
+      </w:pPr>
+      <w:r>
+        <w:t xml:space="preserve">Use Case Findings</w:t>
+      </w:r>
+    </w:p>
+    <w:p>
+      <w:pPr>
+        <w:pStyle w:val="Normal"/>
+      </w:pPr>
+    </w:p>
+    <w:p>
+      <w:pPr>
+        <w:pStyle w:val="Titre2"/>
+      </w:pPr>
+      <w:r>
+        <w:t xml:space="preserve">Finding 01 — Tool Ecosystem: Claude as the Coherent Package</w:t>
+      </w:r>
+    </w:p>
+    <w:p>
+      <w:pPr>
+        <w:pStyle w:val="Normal"/>
+      </w:pPr>
+      <w:r>
+        <w:t xml:space="preserve">Chapter 1 identifies the enterprise tool tier (Microsoft Copilot, Capgemini Neo, Amazon Bedrock) as the primary AI infrastructure. These tools serve a legitimate and important function: controlled, client-safe deployment within governed infrastructure. However, the experimentation documented in Chapters 5 and 6 was conducted almost exclusively on Claude.</w:t>
+      </w:r>
+    </w:p>
+    <w:p>
+      <w:pPr>
+        <w:pStyle w:val="Normal"/>
+      </w:pPr>
+      <w:r>
+        <w:t xml:space="preserve">The reason is architectural coherence. Claude Chat, Claude Code, and the Claude Desktop App are three modes of a single platform — shared context, shared authentication, consistent behaviour. A research session in Chat becomes a specification for Code to implement, which then integrates with an open Excel or PowerPoint file via the Desktop App — without switching tools, re-explaining context, or managing file exports.</w:t>
+      </w:r>
+    </w:p>
+    <w:p>
+      <w:pPr>
+        <w:pStyle w:val="Normal"/>
+      </w:pPr>
+      <w:r>
+        <w:t xml:space="preserve">The implication is not that the enterprise tier is wrong. It is that these are complementary layers for different risk profiles: the enterprise tier for client-facing, governed, data-sensitive work; Claude as the personal research and rapid-experimentation layer. Both have a role. The mistake is expecting the enterprise tier to serve the experimentation function it was not designed for.</w:t>
+      </w:r>
+    </w:p>
+    <w:p>
+      <w:pPr>
+        <w:pStyle w:val="Normal"/>
+      </w:pPr>
+    </w:p>
+    <w:p>
+      <w:pPr>
+        <w:pStyle w:val="Titre2"/>
+      </w:pPr>
+      <w:r>
+        <w:t xml:space="preserve">Finding 02 — Excel &amp; PowerPoint: The Higher Value Is Verification, Not Creation</w:t>
+      </w:r>
+    </w:p>
+    <w:p>
+      <w:pPr>
+        <w:pStyle w:val="Normal"/>
+      </w:pPr>
+      <w:r>
+        <w:t xml:space="preserve">The instinctive use of AI in document work is generation: create a risk register, draft a presentation, produce a WBS. This is genuinely useful and saves material time. However, the higher-value capability identified through experimentation is verification of documents that already exist.</w:t>
+      </w:r>
+    </w:p>
+    <w:p>
+      <w:pPr>
+        <w:pStyle w:val="Normal"/>
+      </w:pPr>
+      <w:r>
+        <w:t xml:space="preserve">A 200-row risk register reaching a Critical Design Review with three rows where the risk score does not match the calculation, two mitigations marked complete with residual risk still rated High, and one owner field blank — these errors are routine, they are embarrassing when surfaced by a client, and they are the kind of errors a tired engineer misses at 5pm the day before a CDR. Claude catches them in seconds by reading every row against the stated logic. No engineer working at speed does this reliably.</w:t>
+      </w:r>
+    </w:p>
+    <w:p>
+      <w:pPr>
+        <w:pStyle w:val="Normal"/>
+      </w:pPr>
+      <w:r>
+        <w:t xml:space="preserve">Recommendation: position the document-verification use case explicitly in any AI adoption programme. It has a fast, measurable ROI (errors caught before formal review), it requires no new infrastructure (the Desktop App or Claude Code suffices), and it addresses a real quality problem that engineers recognise immediately.</w:t>
+      </w:r>
+    </w:p>
+    <w:p>
+      <w:pPr>
+        <w:pStyle w:val="Normal"/>
+      </w:pPr>
+    </w:p>
+    <w:p>
+      <w:pPr>
+        <w:pStyle w:val="Titre2"/>
+      </w:pPr>
+      <w:r>
+        <w:t xml:space="preserve">Finding 03 — Cowork &amp; Skills: Institutional Knowledge Compounds</w:t>
+      </w:r>
+    </w:p>
+    <w:p>
+      <w:pPr>
+        <w:pStyle w:val="Normal"/>
+      </w:pPr>
+      <w:r>
+        <w:t xml:space="preserve">The CLAUDE.md mechanism provides more than AI configuration — it functions as a structured record of how the team works. A well-maintained skills file encodes: the document standards the team applies, the quality criteria it enforces, the terminology it uses with clients, and the output formats it has committed to. This information is currently stored in individual engineers' heads and in scattered SharePoint folders.</w:t>
+      </w:r>
+    </w:p>
+    <w:p>
+      <w:pPr>
+        <w:pStyle w:val="Normal"/>
+      </w:pPr>
+      <w:r>
+        <w:t xml:space="preserve">The compounding effect is significant. After six months of maintenance, a CLAUDE.md represents accumulated institutional knowledge with three simultaneous uses: AI configuration (Claude reads it automatically), onboarding material (new team members understand standards on day one), and a quality standard (it defines what good output looks like in auditable form). The value is independent of whether the team continues using Claude.</w:t>
+      </w:r>
+    </w:p>
+    <w:p>
+      <w:pPr>
+        <w:pStyle w:val="Normal"/>
+      </w:pPr>
+      <w:r>
+        <w:t xml:space="preserve">Recommendation: treat skills file development as a controlled project activity, not an optional AI convenience. Assign ownership, version-control it, and review it at key project milestones. The output compounds; neglect compounds equally.</w:t>
+      </w:r>
+    </w:p>
+    <w:p>
+      <w:pPr>
+        <w:pStyle w:val="Normal"/>
+      </w:pPr>
+    </w:p>
+    <w:p>
+      <w:pPr>
+        <w:pStyle w:val="Titre2"/>
+      </w:pPr>
+      <w:r>
+        <w:t xml:space="preserve">Finding 04 — Agents &amp; LinkedIn: Human-in-Loop Is Architecture, Not Caution</w:t>
+      </w:r>
+    </w:p>
+    <w:p>
+      <w:pPr>
+        <w:pStyle w:val="Normal"/>
+      </w:pPr>
+      <w:r>
+        <w:t xml:space="preserve">The LinkedIn agent experiment confirmed that preparation can be automated at high quality: research briefings, draft posts, personalised connection messages — all produced faster than manual effort and at acceptable first-draft quality. It also confirmed that the human review gate cannot be treated as an optional step.</w:t>
+      </w:r>
+    </w:p>
+    <w:p>
+      <w:pPr>
+        <w:pStyle w:val="Normal"/>
+      </w:pPr>
+      <w:r>
+        <w:t xml:space="preserve">The finding is architectural: the human gate is not a caution recommendation — it is a design requirement. An agent that can publish is fundamentally a different system than an agent that can prepare. The risk profile is not one of occasional error; it is one of reputational exposure at the speed and volume of automation. The workflow must be designed so that publication requires a separate, intentional human action that is technically distinct from the agent's preparation step.</w:t>
+      </w:r>
+    </w:p>
+    <w:p>
+      <w:pPr>
+        <w:pStyle w:val="Normal"/>
+      </w:pPr>
+      <w:r>
+        <w:t xml:space="preserve">This principle generalises beyond LinkedIn. Any agent acting in a professional context — sending emails, updating client records, modifying shared documents — requires the same gate by design. The agent's value is preparation speed; the organisation's responsibility is to ensure that speed does not bypass judgment.</w:t>
+      </w:r>
+    </w:p>
+    <w:p>
+      <w:pPr>
+        <w:pStyle w:val="Normal"/>
+      </w:pPr>
+    </w:p>
+    <w:p>
+      <w:pPr>
+        <w:pStyle w:val="Titre2"/>
+      </w:pPr>
+      <w:r>
+        <w:t xml:space="preserve">Finding 05 — Application Building: The Constraint Is Specification, Not Code</w:t>
+      </w:r>
+    </w:p>
+    <w:p>
+      <w:pPr>
+        <w:pStyle w:val="Normal"/>
+      </w:pPr>
+      <w:r>
+        <w:t xml:space="preserve">Two production-quality applications were shipped — one conversation each. The development timeline for both applications was hours, not weeks. This result was not exceptional; it was reproducible because of one factor: the quality of the initial specification.</w:t>
+      </w:r>
+    </w:p>
+    <w:p>
+      <w:pPr>
+        <w:pStyle w:val="Normal"/>
+      </w:pPr>
+      <w:r>
+        <w:t xml:space="preserve">A precise, testable description of what the application needs to do produces a near-complete first implementation. A vague description produces expensive iteration. The constraint on agentic software development is not Claude's coding capability — it consistently produces working code. The constraint is the clarity of the engineer's requirement. This is a fundamental inversion: the engineer's domain expertise, expressed as a precise specification, becomes the primary determinant of development speed and quality.</w:t>
+      </w:r>
+    </w:p>
+    <w:p>
+      <w:pPr>
+        <w:pStyle w:val="Normal"/>
+      </w:pPr>
+      <w:r>
+        <w:t xml:space="preserve">The implication for systems engineering practitioners is direct. Requirements writing — the core SE skill — is the skill that determines AI-assisted development productivity. A department with strong requirements discipline builds faster with Claude Code than a department without it. The SE competence that was always valuable becomes the critical capability in this new model.</w:t>
+      </w:r>
+    </w:p>
+    <w:p>
+      <w:pPr>
+        <w:pStyle w:val="Normal"/>
+      </w:pPr>
+    </w:p>
+    <w:p>
+      <w:pPr>
+        <w:pStyle w:val="Titre2"/>
+      </w:pPr>
+      <w:r>
+        <w:t xml:space="preserve">Finding 06 — Document Chatbot: Source Document Quality Is the Capability Ceiling</w:t>
+      </w:r>
+    </w:p>
+    <w:p>
+      <w:pPr>
+        <w:pStyle w:val="Normal"/>
+      </w:pPr>
+      <w:r>
+        <w:t xml:space="preserve">The on-premises document chatbot produced reliable, source-cited answers when queried against well-structured engineering procedures. When queried against poorly structured or contradictory documents, answers were incomplete or inconsistent. The model (Llama 3 / Mistral via Ollama) was not the bottleneck. The source material was.</w:t>
+      </w:r>
+    </w:p>
+    <w:p>
+      <w:pPr>
+        <w:pStyle w:val="Normal"/>
+      </w:pPr>
+      <w:r>
+        <w:t xml:space="preserve">This finding has implications beyond the chatbot application. In any RAG system — whether a document Q&amp;A tool, a requirements assistant, or a standards navigator — the quality of the ingested corpus sets the ceiling for what the AI can produce. An LLM cannot synthesise clarity from ambiguous source material. It can only reflect back what is in the documents, with greater or lesser coherence.</w:t>
+      </w:r>
+    </w:p>
+    <w:p>
+      <w:pPr>
+        <w:pStyle w:val="Normal"/>
+      </w:pPr>
+      <w:r>
+        <w:t xml:space="preserve">Recommendation: before deploying a RAG system, audit the source document corpus with the same rigour applied to any knowledge management initiative. AI deployment is an incentive to improve documentation quality, not a substitute for it. Organisations that invest in structured, maintained documentation before AI deployment will realise substantially higher returns than those that ingest unstructured legacy material directly.</w:t>
+      </w:r>
+    </w:p>
+    <w:p>
+      <w:pPr>
+        <w:pStyle w:val="Normal"/>
+      </w:pPr>
+    </w:p>
+    <w:p>
+      <w:pPr>
+        <w:pStyle w:val="Head1"/>
+      </w:pPr>
+      <w:r>
+        <w:t xml:space="preserve">Strategic Implications for Capgemini Engineering SE</w:t>
+      </w:r>
+    </w:p>
+    <w:p>
+      <w:pPr>
+        <w:pStyle w:val="Normal"/>
+      </w:pPr>
+    </w:p>
+    <w:p>
+      <w:pPr>
+        <w:pStyle w:val="Titre2"/>
+      </w:pPr>
+      <w:r>
+        <w:t xml:space="preserve">The SE Practitioner Role Is Shifting from Executor to Specifier</w:t>
+      </w:r>
+    </w:p>
+    <w:p>
+      <w:pPr>
+        <w:pStyle w:val="Normal"/>
+      </w:pPr>
+      <w:r>
+        <w:t xml:space="preserve">The competitive pressure described in Chapter 1 — rising client AI capability compressing the market for operational SE services — is real. The response implied by the findings is more specific than "adopt AI to remain competitive." The findings suggest a particular role transition: from the engineer who executes deliverables to the engineer who specifies what should be produced and verifies that it meets standard.</w:t>
+      </w:r>
+    </w:p>
+    <w:p>
+      <w:pPr>
+        <w:pStyle w:val="Normal"/>
+      </w:pPr>
+      <w:r>
+        <w:t xml:space="preserve">Generation — formatting, modelling, drafting, translating — is becoming an AI function. Specification (knowing what should be produced, at what quality, under what constraints) and verification (confirming that what was produced is correct, traceable, and defensible) remain human functions precisely because they require domain expertise, client context, and professional judgment that cannot be encoded into a prompt.</w:t>
+      </w:r>
+    </w:p>
+    <w:p>
+      <w:pPr>
+        <w:pStyle w:val="Normal"/>
+      </w:pPr>
+      <w:r>
+        <w:t xml:space="preserve">The practitioner who builds and demonstrates strong specification and verification skills — in AI-assisted workflows as much as in traditional SE delivery — is more valuable in the emerging market, not less. The practitioner who executes what AI can now execute is exposed.</w:t>
+      </w:r>
+    </w:p>
+    <w:p>
+      <w:pPr>
+        <w:pStyle w:val="Normal"/>
+      </w:pPr>
+    </w:p>
+    <w:p>
+      <w:pPr>
+        <w:pStyle w:val="Titre2"/>
+      </w:pPr>
+      <w:r>
+        <w:t xml:space="preserve">Proprietary Prompt and Skill Libraries Are Defensible IP</w:t>
+      </w:r>
+    </w:p>
+    <w:p>
+      <w:pPr>
+        <w:pStyle w:val="Normal"/>
+      </w:pPr>
+      <w:r>
+        <w:t xml:space="preserve">Chapter 1 identifies repeat business and proprietary intellectual property as the only durable competitive differentiators. The experimentation documented here suggests a specific form that IP takes in an AI-augmented SE practice: calibrated prompt libraries, verified skill files, and domain-specific RAG corpora tuned to the client's toolchain and naming conventions.</w:t>
+      </w:r>
+    </w:p>
+    <w:p>
+      <w:pPr>
+        <w:pStyle w:val="Normal"/>
+      </w:pPr>
+      <w:r>
+        <w:t xml:space="preserve">A Capella export from an Airbus programme differs structurally from a Rhapsody export from a Renault programme. Prompt templates tuned to these specifics encode knowledge that cannot be replicated without equivalent project experience. A skills file encoding Capgemini's document standards, risk scales, and client terminology is not a configuration file — it is a record of accumulated institutional knowledge that a competitor must spend the same project years to develop.</w:t>
+      </w:r>
+    </w:p>
+    <w:p>
+      <w:pPr>
+        <w:pStyle w:val="Normal"/>
+      </w:pPr>
+      <w:r>
+        <w:t xml:space="preserve">Recommendation: treat prompt libraries and CLAUDE.md skill files as controlled IP assets. Version-control them, assign ownership, include them in project close-out documentation, and maintain a central repository accessible to the department. The compounding value described in Finding 03 only materialises if these assets are preserved and shared, not left on individual engineers' machines.</w:t>
+      </w:r>
+    </w:p>
+    <w:p>
+      <w:pPr>
+        <w:pStyle w:val="Normal"/>
+      </w:pPr>
+    </w:p>
+    <w:p>
+      <w:pPr>
+        <w:pStyle w:val="Titre2"/>
+      </w:pPr>
+      <w:r>
+        <w:t xml:space="preserve">Data Sovereignty Is a Competitive Differentiator in Regulated Sectors</w:t>
+      </w:r>
+    </w:p>
+    <w:p>
+      <w:pPr>
+        <w:pStyle w:val="Normal"/>
+      </w:pPr>
+      <w:r>
+        <w:t xml:space="preserve">The on-premises document chatbot (Experiment 06) demonstrated that AI capability at production quality is achievable with zero data egress. For Capgemini Engineering's clients in aerospace, defence, and automotive — sectors where controlled-classification engineering data must not reach external servers — this architecture is not a nice-to-have. It is a requirement.</w:t>
+      </w:r>
+    </w:p>
+    <w:p>
+      <w:pPr>
+        <w:pStyle w:val="Normal"/>
+      </w:pPr>
+      <w:r>
+        <w:t xml:space="preserve">The finding is that this requirement can now be met without sacrificing capability. Ollama running Llama 3 or Mistral on local hardware, combined with ChromaDB for semantic retrieval, produces a document Q&amp;A system comparable in quality to cloud-based alternatives for the specific use case of engineering procedure and standards navigation. The gap between on-premises and cloud capability is closing faster than most enterprise AI strategies anticipated.</w:t>
+      </w:r>
+    </w:p>
+    <w:p>
+      <w:pPr>
+        <w:pStyle w:val="Normal"/>
+      </w:pPr>
+      <w:r>
+        <w:t xml:space="preserve">Recommendation: develop a reference architecture for on-premises AI deployment that can be proposed to clients as a deliverable. The ability to build, configure, and hand over a data-sovereign AI system — trained on the client's own documents, running on the client's own infrastructure — is a differentiated capability that very few engineering consultancies can offer today.</w:t>
+      </w:r>
+    </w:p>
+    <w:p>
+      <w:pPr>
+        <w:pStyle w:val="Normal"/>
+      </w:pPr>
+    </w:p>
+    <w:p>
+      <w:pPr>
+        <w:pStyle w:val="Titre2"/>
+      </w:pPr>
+      <w:r>
+        <w:t xml:space="preserve">Near-Term Investment Priorities</w:t>
+      </w:r>
+    </w:p>
+    <w:p>
+      <w:pPr>
+        <w:pStyle w:val="Normal"/>
+      </w:pPr>
+      <w:r>
+        <w:t xml:space="preserve">Based on the findings across all six experiments, three near-term investments are recommended for the Systems Engineering department:</w:t>
+      </w:r>
+    </w:p>
+    <w:p>
+      <w:pPr>
+        <w:pStyle w:val="Normal"/>
+      </w:pPr>
+      <w:r>
+        <w:t xml:space="preserve">1. Document verification workflows: Develop a standard Claude-assisted QA protocol for the five highest-frequency deliverable types (risk register, RTM, WBS, status report, ICD log). Measure error catch rates before and after AI-assisted review. This has the fastest measurable ROI and the lowest deployment risk of any use case tested.</w:t>
+      </w:r>
+    </w:p>
+    <w:p>
+      <w:pPr>
+        <w:pStyle w:val="Normal"/>
+      </w:pPr>
+      <w:r>
+        <w:t xml:space="preserve">2. Department skills file (CLAUDE.md): Commission a half-day workshop to draft the first version of a department-level CLAUDE.md encoding Capgemini SE document standards, client terminology, and quality criteria. Version-control it and assign a named owner for quarterly updates. This asset compounds; every quarter of delay is a quarter of compounding foregone.</w:t>
+      </w:r>
+    </w:p>
+    <w:p>
+      <w:pPr>
+        <w:pStyle w:val="Normal"/>
+      </w:pPr>
+      <w:r>
+        <w:t xml:space="preserve">3. On-premises RAG pilot: Identify one client engagement where engineering documentation quality is high and data sensitivity is a constraint. Propose and build an on-premises document Q&amp;A system as a project deliverable. Use it to develop a reusable reference architecture and a deployment playbook.</w:t>
       </w:r>
     </w:p>
     <w:p>

</xml_diff>